<commit_message>
Draft_126_body: Recommendations vertical/horizontal baseline; life-science teaching focus
Panel revision. Conclusions contribution line aligned.
</commit_message>
<xml_diff>
--- a/thesis/003_ThesisProposal_Draft_126_body.docx
+++ b/thesis/003_ThesisProposal_Draft_126_body.docx
@@ -23144,11 +23144,11 @@
           <w:bCs w:val="0"/>
           <w:i w:val="0"/>
           <w:iCs w:val="0"/>
-          <w:sz w:val="22"/>
+          <w:sz w:val="24"/>
           <w:szCs w:val="22"/>
           <w:rtl w:val="0"/>
         </w:rPr>
-        <w:t xml:space="preserve">The contribution is therefore a baseline, not a verdict on competence or on whole disciplines. For BAELS and related instruction, the finding matters because it shows what "hedging in science abstracts" looks like on the ground at this campus: uneven, lexically narrow, and easy to miss if teaching assumes a full academic repertoire. For research, the same baseline makes later comparison possible, against expert abstracts, other programs, or fuller thesis chapters where other functions of mitigation may have more room.</w:t>
+        <w:t>The contribution is therefore a baseline, not a verdict on competence or on whole disciplines. It shows what hedging looks like in ratified undergraduate thesis abstracts from Agriculture, Veterinary Medicine, and Biology at this campus: uneven, lexically narrow, and easy to miss if instruction assumes a full academic repertoire. For research, the same baseline makes later comparison possible, against expert abstracts, other programs, higher-degree work, or fuller thesis chapters where other functions of mitigation may have more room.</w:t>
       </w:r>
       <w:r>
         <w:rPr>
@@ -23227,11 +23227,11 @@
           <w:bCs w:val="0"/>
           <w:i w:val="0"/>
           <w:iCs w:val="0"/>
-          <w:sz w:val="22"/>
+          <w:sz w:val="24"/>
           <w:szCs w:val="22"/>
           <w:rtl w:val="0"/>
         </w:rPr>
-        <w:t xml:space="preserve">Teachers in the BAELS program and related writing courses may use the local pattern as a teaching resource. Many abstracts in the sample soften little. When they do, the work is concentrated in a narrow set of forms, mainly lexical items such as potential and suggest, with modal verbs as the other main resource. Instruction that assumes a full academic hedging repertoire will miss what this campus sample shows. Classroom tasks may instead train students to match the strength of a claim to the strength of the evidence in the same sentence.</w:t>
+        <w:t>Writing instructors and thesis advisers in Agriculture, Veterinary Medicine, and Biology at PSAU may use the local pattern as a teaching resource for those programs. Many abstracts in the sample soften little. When they do, the work is concentrated in a narrow set of forms, mainly lexical items such as potential and suggest, with modal verbs as the other main resource. Instruction that assumes a full academic hedging repertoire will miss what this campus sample shows in applied life science abstracts. Classroom or supervisory tasks may instead train students in these programs to match the strength of a claim to the strength of the evidence in the same sentence.</w:t>
       </w:r>
       <w:r>
         <w:rPr>
@@ -23253,11 +23253,11 @@
           <w:bCs w:val="0"/>
           <w:i w:val="0"/>
           <w:iCs w:val="0"/>
-          <w:sz w:val="22"/>
+          <w:sz w:val="24"/>
           <w:szCs w:val="22"/>
           <w:rtl w:val="0"/>
         </w:rPr>
-        <w:t xml:space="preserve">Future researchers may use this study as a local baseline for undergraduate thesis abstracts in Agriculture, Veterinary Medicine, and Biology at PSAU. They may expand the design with inter-rater coding on at least a subset of the corpus, with independent proficiency measures, or with a matched set of expert abstracts from the same three programs. Those steps would help separate genre compression in the abstract from writer resource limits and from adviser-enforced departmental standards.</w:t>
+        <w:t>Future researchers may use this study as a local baseline for undergraduate thesis abstracts in Agriculture, Veterinary Medicine, and Biology at PSAU. Vertically, the inventory can anchor comparisons with higher-degree work in the same or related programs, including master's theses and other graduate research writing, so that change across academic levels can be measured against an undergraduate reference point. Horizontally, the same baseline supports discipline-focused comparisons with other fields, such as soft versus hard science, humanities versus science, or applied life sciences versus other science programs, at PSAU or elsewhere. Researchers may also expand the present design with inter-rater coding on at least a subset of the corpus, with independent proficiency measures, or with a matched set of expert abstracts from the same three programs. Those steps would help separate genre compression in the abstract from writer resource limits and from adviser-enforced departmental standards.</w:t>
       </w:r>
       <w:r>
         <w:rPr>

</xml_diff>

<commit_message>
Draft_126_body: drop search-methods gap sentence; soften no-study claims
</commit_message>
<xml_diff>
--- a/thesis/003_ThesisProposal_Draft_126_body.docx
+++ b/thesis/003_ThesisProposal_Draft_126_body.docx
@@ -1584,11 +1584,11 @@
           <w:bCs w:val="0"/>
           <w:i w:val="0"/>
           <w:iCs w:val="0"/>
-          <w:sz w:val="22"/>
+          <w:sz w:val="24"/>
           <w:szCs w:val="22"/>
           <w:rtl w:val="0"/>
         </w:rPr>
-        <w:t xml:space="preserve">Outside student essays and research articles, Philippine editorial writing shows hedging as a context-sensitive resource rather than a fixed national style. Villanueva (2014) examined 30 editorials from three leading Philippine newspapers and found that nearly half of the hedges were references to official reports or authorities, with modals and adverbs making up a little over 30 percent. Those forms helped editors manage accountability and soften claims on politically sensitive topics. Grengia (2025) extended the editorial analysis to student publications, The Philippine Collegian and The LaSallian, and found deliberate but publication-specific hedge use tied to voice, audience, and rhetorical goals. Taken together, the Philippine evidence shows modal-heavy inventories, frequent booster preference in learner writing, and higher hedge density in some professional Filipino ELT research than in comparable EFL contexts. No published study identified in this review has examined hedging in undergraduate thesis abstracts from applied life sciences in a Philippine setting. That gap is the present study's descriptive starting point.</w:t>
+        <w:t>Outside student essays and research articles, Philippine editorial writing shows hedging as a context-sensitive resource rather than a fixed national style. Villanueva (2014) examined 30 editorials from three leading Philippine newspapers and found that nearly half of the hedges were references to official reports or authorities, with modals and adverbs making up a little over 30 percent. Those forms helped editors manage accountability and soften claims on politically sensitive topics. Grengia (2025) extended the editorial analysis to student publications, The Philippine Collegian and The LaSallian, and found deliberate but publication-specific hedge use tied to voice, audience, and rhetorical goals. Taken together, the Philippine evidence shows modal-heavy inventories, frequent booster preference in learner writing, and higher hedge density in some professional Filipino ELT research than in comparable EFL contexts. To the best of the researcher’s knowledge, published work has not yet examined hedging in undergraduate thesis abstracts from applied life sciences in a Philippine setting. That gap is the present study’s descriptive starting point.</w:t>
       </w:r>
       <w:r>
         <w:rPr>
@@ -1927,11 +1927,11 @@
           <w:bCs w:val="0"/>
           <w:i w:val="0"/>
           <w:iCs w:val="0"/>
-          <w:sz w:val="22"/>
+          <w:sz w:val="24"/>
           <w:szCs w:val="22"/>
           <w:rtl w:val="0"/>
         </w:rPr>
-        <w:t xml:space="preserve">The empirical gap was checked through searches of Google Scholar, ERIC, and ScienceDirect (2010–2025) using combinations of hedging, hedges, epistemic stance, undergraduate, thesis abstract, research abstract, Agriculture, Veterinary Medicine, Biology, Philippines, and second language, with follow-up citation chaining from key reviews and regional studies cited above. No published study identified in that search has examined hedging in undergraduate thesis abstracts from applied science disciplines in a Philippine context.</w:t>
+        <w:t>To the best of the researcher’s knowledge, published work has not yet mapped hedging in undergraduate thesis abstracts from applied science disciplines in a Philippine setting.</w:t>
       </w:r>
       <w:r>
         <w:rPr>
@@ -23022,11 +23022,11 @@
           <w:bCs w:val="0"/>
           <w:i w:val="0"/>
           <w:iCs w:val="0"/>
-          <w:sz w:val="22"/>
+          <w:sz w:val="24"/>
           <w:szCs w:val="22"/>
           <w:rtl w:val="0"/>
         </w:rPr>
-        <w:t xml:space="preserve">This study addressed a local gap: no published study identified in this review had mapped how developing researchers in Agriculture, Veterinary Medicine, and Biology at PSAU manage uncertainty in English thesis abstracts. From that gap, the inquiry traced what types of hedging appear in those abstracts, how often they occur across the three programs, what functions the retained devices serve, and what those patterns suggest about epistemic stance in the ratified text. The analysis drew on Hyland’s (1998) formal types, treated Epistemic Caution and Politeness/Deference as the two forms of stance change toward a proposition, and used Crompton’s (1997) restatement logic to inform the Working Test. Sixty complete English abstracts, twenty per discipline, were coded through a wide net of candidates, a claim condition with paired removal checks, and type assignment on retained hedges only.</w:t>
+        <w:t>This study addressed a local gap: published research, as reviewed here, has not yet mapped how developing researchers in Agriculture, Veterinary Medicine, and Biology at PSAU manage uncertainty in English thesis abstracts. From that gap, the inquiry traced what types of hedging appear in those abstracts, how often they occur across the three programs, what functions the retained devices serve, and what those patterns suggest about epistemic stance in the ratified text. The analysis drew on Hyland’s (1998) formal types, treated Epistemic Caution and Politeness/Deference as the two forms of stance change toward a proposition, and used Crompton’s (1997) restatement logic to inform the Working Test. Sixty complete English abstracts, twenty per discipline, were coded through a wide net of candidates, a claim condition with paired removal checks, and type assignment on retained hedges only.</w:t>
       </w:r>
       <w:r>
         <w:rPr>

</xml_diff>

<commit_message>
Draft_126_body: gap claims A5, B2, C4
</commit_message>
<xml_diff>
--- a/thesis/003_ThesisProposal_Draft_126_body.docx
+++ b/thesis/003_ThesisProposal_Draft_126_body.docx
@@ -1588,7 +1588,7 @@
           <w:szCs w:val="22"/>
           <w:rtl w:val="0"/>
         </w:rPr>
-        <w:t>Outside student essays and research articles, Philippine editorial writing shows hedging as a context-sensitive resource rather than a fixed national style. Villanueva (2014) examined 30 editorials from three leading Philippine newspapers and found that nearly half of the hedges were references to official reports or authorities, with modals and adverbs making up a little over 30 percent. Those forms helped editors manage accountability and soften claims on politically sensitive topics. Grengia (2025) extended the editorial analysis to student publications, The Philippine Collegian and The LaSallian, and found deliberate but publication-specific hedge use tied to voice, audience, and rhetorical goals. Taken together, the Philippine evidence shows modal-heavy inventories, frequent booster preference in learner writing, and higher hedge density in some professional Filipino ELT research than in comparable EFL contexts. To the best of the researcher’s knowledge, published work has not yet examined hedging in undergraduate thesis abstracts from applied life sciences in a Philippine setting. That gap is the present study’s descriptive starting point.</w:t>
+        <w:t>Outside student essays and research articles, Philippine editorial writing shows hedging as a context-sensitive resource rather than a fixed national style. Villanueva (2014) examined 30 editorials from three leading Philippine newspapers and found that nearly half of the hedges were references to official reports or authorities, with modals and adverbs making up a little over 30 percent. Those forms helped editors manage accountability and soften claims on politically sensitive topics. Grengia (2025) extended the editorial analysis to student publications, The Philippine Collegian and The LaSallian, and found deliberate but publication-specific hedge use tied to voice, audience, and rhetorical goals. Taken together, the Philippine evidence shows modal-heavy inventories, frequent booster preference in learner writing, and higher hedge density in some professional Filipino ELT research than in comparable EFL contexts. Published accounts of student hedging in the Philippines have centered on essays, education theses, or professional ELT articles rather than applied life-science undergraduate thesis abstracts. That gap is the present study’s descriptive starting point.</w:t>
       </w:r>
       <w:r>
         <w:rPr>
@@ -1931,7 +1931,7 @@
           <w:szCs w:val="22"/>
           <w:rtl w:val="0"/>
         </w:rPr>
-        <w:t>To the best of the researcher’s knowledge, published work has not yet mapped hedging in undergraduate thesis abstracts from applied science disciplines in a Philippine setting.</w:t>
+        <w:t>This review did not identify published studies that map hedging in undergraduate thesis abstracts from applied science disciplines in a Philippine setting.</w:t>
       </w:r>
       <w:r>
         <w:rPr>
@@ -23026,7 +23026,7 @@
           <w:szCs w:val="22"/>
           <w:rtl w:val="0"/>
         </w:rPr>
-        <w:t>This study addressed a local gap: published research, as reviewed here, has not yet mapped how developing researchers in Agriculture, Veterinary Medicine, and Biology at PSAU manage uncertainty in English thesis abstracts. From that gap, the inquiry traced what types of hedging appear in those abstracts, how often they occur across the three programs, what functions the retained devices serve, and what those patterns suggest about epistemic stance in the ratified text. The analysis drew on Hyland’s (1998) formal types, treated Epistemic Caution and Politeness/Deference as the two forms of stance change toward a proposition, and used Crompton’s (1997) restatement logic to inform the Working Test. Sixty complete English abstracts, twenty per discipline, were coded through a wide net of candidates, a claim condition with paired removal checks, and type assignment on retained hedges only.</w:t>
+        <w:t>This study addressed a local gap at PSAU: how developing researchers in Agriculture, Veterinary Medicine, and Biology manage uncertainty in English thesis abstracts. From that gap, the inquiry traced what types of hedging appear in those abstracts, how often they occur across the three programs, what functions the retained devices serve, and what those patterns suggest about epistemic stance in the ratified text. The analysis drew on Hyland’s (1998) formal types, treated Epistemic Caution and Politeness/Deference as the two forms of stance change toward a proposition, and used Crompton’s (1997) restatement logic to inform the Working Test. Sixty complete English abstracts, twenty per discipline, were coded through a wide net of candidates, a claim condition with paired removal checks, and type assignment on retained hedges only.</w:t>
       </w:r>
       <w:r>
         <w:rPr>

</xml_diff>

<commit_message>
Draft_126_body: Georgia 11pt on edited body paragraphs
</commit_message>
<xml_diff>
--- a/thesis/003_ThesisProposal_Draft_126_body.docx
+++ b/thesis/003_ThesisProposal_Draft_126_body.docx
@@ -1580,11 +1580,7 @@
       <w:r>
         <w:rPr>
           <w:rFonts w:ascii="Georgia" w:cs="Georgia" w:eastAsia="Georgia" w:hAnsi="Georgia"/>
-          <w:b w:val="0"/>
-          <w:bCs w:val="0"/>
-          <w:i w:val="0"/>
-          <w:iCs w:val="0"/>
-          <w:sz w:val="24"/>
+          <w:sz w:val="22"/>
           <w:szCs w:val="22"/>
           <w:rtl w:val="0"/>
         </w:rPr>
@@ -1592,7 +1588,10 @@
       </w:r>
       <w:r>
         <w:rPr>
-          <w:rtl w:val="0"/>
+          <w:rFonts w:ascii="Georgia" w:hAnsi="Georgia" w:cs="Georgia" w:eastAsia="Georgia"/>
+          <w:sz w:val="22"/>
+          <w:rtl w:val="0"/>
+          <w:szCs w:val="22"/>
         </w:rPr>
       </w:r>
     </w:p>
@@ -1923,11 +1922,7 @@
       <w:r>
         <w:rPr>
           <w:rFonts w:ascii="Georgia" w:cs="Georgia" w:eastAsia="Georgia" w:hAnsi="Georgia"/>
-          <w:b w:val="0"/>
-          <w:bCs w:val="0"/>
-          <w:i w:val="0"/>
-          <w:iCs w:val="0"/>
-          <w:sz w:val="24"/>
+          <w:sz w:val="22"/>
           <w:szCs w:val="22"/>
           <w:rtl w:val="0"/>
         </w:rPr>
@@ -1935,7 +1930,10 @@
       </w:r>
       <w:r>
         <w:rPr>
-          <w:rtl w:val="0"/>
+          <w:rFonts w:ascii="Georgia" w:hAnsi="Georgia" w:cs="Georgia" w:eastAsia="Georgia"/>
+          <w:sz w:val="22"/>
+          <w:rtl w:val="0"/>
+          <w:szCs w:val="22"/>
         </w:rPr>
       </w:r>
     </w:p>
@@ -23018,11 +23016,7 @@
       <w:r>
         <w:rPr>
           <w:rFonts w:ascii="Georgia" w:cs="Georgia" w:eastAsia="Georgia" w:hAnsi="Georgia"/>
-          <w:b w:val="0"/>
-          <w:bCs w:val="0"/>
-          <w:i w:val="0"/>
-          <w:iCs w:val="0"/>
-          <w:sz w:val="24"/>
+          <w:sz w:val="22"/>
           <w:szCs w:val="22"/>
           <w:rtl w:val="0"/>
         </w:rPr>
@@ -23030,7 +23024,10 @@
       </w:r>
       <w:r>
         <w:rPr>
-          <w:rtl w:val="0"/>
+          <w:rFonts w:ascii="Georgia" w:hAnsi="Georgia" w:cs="Georgia" w:eastAsia="Georgia"/>
+          <w:sz w:val="22"/>
+          <w:rtl w:val="0"/>
+          <w:szCs w:val="22"/>
         </w:rPr>
       </w:r>
     </w:p>
@@ -23140,11 +23137,7 @@
       <w:r>
         <w:rPr>
           <w:rFonts w:ascii="Georgia" w:cs="Georgia" w:eastAsia="Georgia" w:hAnsi="Georgia"/>
-          <w:b w:val="0"/>
-          <w:bCs w:val="0"/>
-          <w:i w:val="0"/>
-          <w:iCs w:val="0"/>
-          <w:sz w:val="24"/>
+          <w:sz w:val="22"/>
           <w:szCs w:val="22"/>
           <w:rtl w:val="0"/>
         </w:rPr>
@@ -23152,7 +23145,10 @@
       </w:r>
       <w:r>
         <w:rPr>
-          <w:rtl w:val="0"/>
+          <w:rFonts w:ascii="Georgia" w:hAnsi="Georgia" w:cs="Georgia" w:eastAsia="Georgia"/>
+          <w:sz w:val="22"/>
+          <w:rtl w:val="0"/>
+          <w:szCs w:val="22"/>
         </w:rPr>
       </w:r>
     </w:p>
@@ -23197,10 +23193,6 @@
       <w:r>
         <w:rPr>
           <w:rFonts w:ascii="Georgia" w:cs="Georgia" w:eastAsia="Georgia" w:hAnsi="Georgia"/>
-          <w:b w:val="0"/>
-          <w:bCs w:val="0"/>
-          <w:i w:val="0"/>
-          <w:iCs w:val="0"/>
           <w:sz w:val="22"/>
           <w:szCs w:val="22"/>
           <w:rtl w:val="0"/>
@@ -23209,7 +23201,10 @@
       </w:r>
       <w:r>
         <w:rPr>
-          <w:rtl w:val="0"/>
+          <w:rFonts w:ascii="Georgia" w:hAnsi="Georgia" w:cs="Georgia" w:eastAsia="Georgia"/>
+          <w:sz w:val="22"/>
+          <w:rtl w:val="0"/>
+          <w:szCs w:val="22"/>
         </w:rPr>
       </w:r>
     </w:p>
@@ -23223,11 +23218,7 @@
       <w:r>
         <w:rPr>
           <w:rFonts w:ascii="Georgia" w:cs="Georgia" w:eastAsia="Georgia" w:hAnsi="Georgia"/>
-          <w:b w:val="0"/>
-          <w:bCs w:val="0"/>
-          <w:i w:val="0"/>
-          <w:iCs w:val="0"/>
-          <w:sz w:val="24"/>
+          <w:sz w:val="22"/>
           <w:szCs w:val="22"/>
           <w:rtl w:val="0"/>
         </w:rPr>
@@ -23235,7 +23226,10 @@
       </w:r>
       <w:r>
         <w:rPr>
-          <w:rtl w:val="0"/>
+          <w:rFonts w:ascii="Georgia" w:hAnsi="Georgia" w:cs="Georgia" w:eastAsia="Georgia"/>
+          <w:sz w:val="22"/>
+          <w:rtl w:val="0"/>
+          <w:szCs w:val="22"/>
         </w:rPr>
       </w:r>
     </w:p>
@@ -23249,11 +23243,7 @@
       <w:r>
         <w:rPr>
           <w:rFonts w:ascii="Georgia" w:cs="Georgia" w:eastAsia="Georgia" w:hAnsi="Georgia"/>
-          <w:b w:val="0"/>
-          <w:bCs w:val="0"/>
-          <w:i w:val="0"/>
-          <w:iCs w:val="0"/>
-          <w:sz w:val="24"/>
+          <w:sz w:val="22"/>
           <w:szCs w:val="22"/>
           <w:rtl w:val="0"/>
         </w:rPr>
@@ -23261,7 +23251,10 @@
       </w:r>
       <w:r>
         <w:rPr>
-          <w:rtl w:val="0"/>
+          <w:rFonts w:ascii="Georgia" w:hAnsi="Georgia" w:cs="Georgia" w:eastAsia="Georgia"/>
+          <w:sz w:val="22"/>
+          <w:rtl w:val="0"/>
+          <w:szCs w:val="22"/>
         </w:rPr>
       </w:r>
     </w:p>

</xml_diff>

<commit_message>
Draft_126_body: keepNext Figure 1 label and caption with image
</commit_message>
<xml_diff>
--- a/thesis/003_ThesisProposal_Draft_126_body.docx
+++ b/thesis/003_ThesisProposal_Draft_126_body.docx
@@ -2239,11 +2239,12 @@
         <w:ind w:left="0" w:right="0" w:firstLine="0"/>
         <w:jc w:val="left"/>
         <w:rPr/>
-      </w:pPr>
-      <w:r>
-        <w:rPr>
-          <w:rFonts w:ascii="Georgia" w:cs="Georgia" w:eastAsia="Georgia" w:hAnsi="Georgia"/>
-          <w:b w:val="1"/>
+        <w:keepNext/>
+      </w:pPr>
+      <w:r>
+        <w:rPr>
+          <w:rFonts w:ascii="Georgia" w:cs="Georgia" w:eastAsia="Georgia" w:hAnsi="Georgia"/>
+          <w:b/>
           <w:bCs w:val="1"/>
           <w:i w:val="0"/>
           <w:iCs w:val="0"/>
@@ -2265,12 +2266,11 @@
         <w:ind w:left="0" w:right="0" w:firstLine="0"/>
         <w:jc w:val="left"/>
         <w:rPr/>
-      </w:pPr>
-      <w:r>
-        <w:rPr>
-          <w:rFonts w:ascii="Georgia" w:cs="Georgia" w:eastAsia="Georgia" w:hAnsi="Georgia"/>
-          <w:b w:val="0"/>
-          <w:bCs w:val="0"/>
+        <w:keepNext/>
+      </w:pPr>
+      <w:r>
+        <w:rPr>
+          <w:rFonts w:ascii="Georgia" w:cs="Georgia" w:eastAsia="Georgia" w:hAnsi="Georgia"/>
           <w:i w:val="0"/>
           <w:iCs w:val="0"/>
           <w:sz w:val="22"/>

</xml_diff>

<commit_message>
Draft_126_body: wrap Figure 1 label/caption/image in unbreakable cell
</commit_message>
<xml_diff>
--- a/thesis/003_ThesisProposal_Draft_126_body.docx
+++ b/thesis/003_ThesisProposal_Draft_126_body.docx
@@ -2233,106 +2233,139 @@
         </w:rPr>
       </w:r>
     </w:p>
-    <w:p>
-      <w:pPr>
-        <w:spacing w:after="0" w:before="240" w:line="480" w:lineRule="auto"/>
-        <w:ind w:left="0" w:right="0" w:firstLine="0"/>
-        <w:jc w:val="left"/>
-        <w:rPr/>
-        <w:keepNext/>
-      </w:pPr>
-      <w:r>
-        <w:rPr>
-          <w:rFonts w:ascii="Georgia" w:cs="Georgia" w:eastAsia="Georgia" w:hAnsi="Georgia"/>
-          <w:b/>
-          <w:bCs w:val="1"/>
-          <w:i w:val="0"/>
-          <w:iCs w:val="0"/>
-          <w:sz w:val="22"/>
-          <w:szCs w:val="22"/>
-          <w:rtl w:val="0"/>
-        </w:rPr>
-        <w:t xml:space="preserve">Figure 1</w:t>
-      </w:r>
-      <w:r>
-        <w:rPr>
-          <w:rtl w:val="0"/>
-        </w:rPr>
-      </w:r>
-    </w:p>
-    <w:p>
-      <w:pPr>
-        <w:spacing w:after="240" w:before="0" w:line="480" w:lineRule="auto"/>
-        <w:ind w:left="0" w:right="0" w:firstLine="0"/>
-        <w:jc w:val="left"/>
-        <w:rPr/>
-        <w:keepNext/>
-      </w:pPr>
-      <w:r>
-        <w:rPr>
-          <w:rFonts w:ascii="Georgia" w:cs="Georgia" w:eastAsia="Georgia" w:hAnsi="Georgia"/>
-          <w:i w:val="0"/>
-          <w:iCs w:val="0"/>
-          <w:sz w:val="22"/>
-          <w:szCs w:val="22"/>
-          <w:rtl w:val="0"/>
-        </w:rPr>
-        <w:t xml:space="preserve">Conceptual Framework of the Study</w:t>
-      </w:r>
-      <w:r>
-        <w:rPr>
-          <w:rtl w:val="0"/>
-        </w:rPr>
-      </w:r>
-    </w:p>
-    <w:p>
-      <w:pPr>
-        <w:spacing w:after="240" w:before="0" w:line="480" w:lineRule="auto"/>
-        <w:ind w:left="0" w:right="0" w:firstLine="0"/>
-        <w:jc w:val="center"/>
-        <w:rPr/>
-      </w:pPr>
-      <w:r>
-        <w:rPr/>
-        <w:drawing>
-          <wp:inline distB="0" distT="0" distL="0" distR="0">
-            <wp:extent cx="3601720" cy="2851785"/>
-            <wp:effectExtent b="0" l="0" r="0" t="0"/>
-            <wp:docPr id="1" name="image1.png"/>
-            <a:graphic>
-              <a:graphicData uri="http://schemas.openxmlformats.org/drawingml/2006/picture">
-                <pic:pic>
-                  <pic:nvPicPr>
-                    <pic:cNvPr id="0" name="image1.png"/>
-                    <pic:cNvPicPr preferRelativeResize="0"/>
-                  </pic:nvPicPr>
-                  <pic:blipFill>
-                    <a:blip r:embed="rId10"/>
-                    <a:srcRect b="0" l="0" r="0" t="0"/>
-                    <a:stretch>
-                      <a:fillRect/>
-                    </a:stretch>
-                  </pic:blipFill>
-                  <pic:spPr>
-                    <a:xfrm>
-                      <a:off x="0" y="0"/>
-                      <a:ext cx="3601720" cy="2851785"/>
-                    </a:xfrm>
-                    <a:prstGeom prst="rect"/>
-                    <a:ln/>
-                  </pic:spPr>
-                </pic:pic>
-              </a:graphicData>
-            </a:graphic>
-          </wp:inline>
-        </w:drawing>
-      </w:r>
-      <w:r>
-        <w:rPr>
-          <w:rtl w:val="0"/>
-        </w:rPr>
-      </w:r>
-    </w:p>
+    <w:tbl>
+      <w:tblPr>
+        <w:tblW w:w="5000" w:type="pct"/>
+        <w:tblBorders>
+          <w:top w:val="nil" w:sz="0" w:space="0" w:color="auto"/>
+          <w:left w:val="nil" w:sz="0" w:space="0" w:color="auto"/>
+          <w:bottom w:val="nil" w:sz="0" w:space="0" w:color="auto"/>
+          <w:right w:val="nil" w:sz="0" w:space="0" w:color="auto"/>
+          <w:insideH w:val="nil" w:sz="0" w:space="0" w:color="auto"/>
+          <w:insideV w:val="nil" w:sz="0" w:space="0" w:color="auto"/>
+        </w:tblBorders>
+        <w:tblInd w:w="0" w:type="dxa"/>
+      </w:tblPr>
+      <w:tblGrid>
+        <w:gridCol w:w="9360"/>
+      </w:tblGrid>
+      <w:tr>
+        <w:trPr>
+          <w:cantSplit/>
+        </w:trPr>
+        <w:tc>
+          <w:tcPr>
+            <w:tcW w:w="9360" w:type="dxa"/>
+            <w:tcBorders>
+              <w:top w:val="nil" w:sz="0" w:space="0" w:color="auto"/>
+              <w:left w:val="nil" w:sz="0" w:space="0" w:color="auto"/>
+              <w:bottom w:val="nil" w:sz="0" w:space="0" w:color="auto"/>
+              <w:right w:val="nil" w:sz="0" w:space="0" w:color="auto"/>
+            </w:tcBorders>
+          </w:tcPr>
+          <w:p>
+            <w:pPr>
+              <w:spacing w:after="0" w:before="240" w:line="480" w:lineRule="auto"/>
+              <w:ind w:left="0" w:right="0" w:firstLine="0"/>
+              <w:jc w:val="left"/>
+              <w:rPr/>
+              <w:keepNext/>
+            </w:pPr>
+            <w:r>
+              <w:rPr>
+                <w:rFonts w:ascii="Georgia" w:cs="Georgia" w:eastAsia="Georgia" w:hAnsi="Georgia"/>
+                <w:b/>
+                <w:bCs w:val="1"/>
+                <w:i w:val="0"/>
+                <w:iCs w:val="0"/>
+                <w:sz w:val="22"/>
+                <w:szCs w:val="22"/>
+                <w:rtl w:val="0"/>
+              </w:rPr>
+              <w:t xml:space="preserve">Figure 1</w:t>
+            </w:r>
+            <w:r>
+              <w:rPr>
+                <w:rtl w:val="0"/>
+              </w:rPr>
+            </w:r>
+          </w:p>
+          <w:p>
+            <w:pPr>
+              <w:spacing w:after="240" w:before="0" w:line="480" w:lineRule="auto"/>
+              <w:ind w:left="0" w:right="0" w:firstLine="0"/>
+              <w:jc w:val="left"/>
+              <w:rPr/>
+              <w:keepNext/>
+            </w:pPr>
+            <w:r>
+              <w:rPr>
+                <w:rFonts w:ascii="Georgia" w:cs="Georgia" w:eastAsia="Georgia" w:hAnsi="Georgia"/>
+                <w:i w:val="0"/>
+                <w:iCs w:val="0"/>
+                <w:sz w:val="22"/>
+                <w:szCs w:val="22"/>
+                <w:rtl w:val="0"/>
+              </w:rPr>
+              <w:t xml:space="preserve">Conceptual Framework of the Study</w:t>
+            </w:r>
+            <w:r>
+              <w:rPr>
+                <w:rtl w:val="0"/>
+              </w:rPr>
+            </w:r>
+          </w:p>
+          <w:p>
+            <w:pPr>
+              <w:spacing w:after="240" w:before="0" w:line="480" w:lineRule="auto"/>
+              <w:ind w:left="0" w:right="0" w:firstLine="0"/>
+              <w:jc w:val="center"/>
+              <w:rPr/>
+            </w:pPr>
+            <w:r>
+              <w:rPr/>
+              <w:drawing>
+                <wp:inline distB="0" distT="0" distL="0" distR="0">
+                  <wp:extent cx="3601720" cy="2851785"/>
+                  <wp:effectExtent b="0" l="0" r="0" t="0"/>
+                  <wp:docPr id="1" name="image1.png"/>
+                  <a:graphic>
+                    <a:graphicData uri="http://schemas.openxmlformats.org/drawingml/2006/picture">
+                      <pic:pic>
+                        <pic:nvPicPr>
+                          <pic:cNvPr id="0" name="image1.png"/>
+                          <pic:cNvPicPr preferRelativeResize="0"/>
+                        </pic:nvPicPr>
+                        <pic:blipFill>
+                          <a:blip r:embed="rId10"/>
+                          <a:srcRect b="0" l="0" r="0" t="0"/>
+                          <a:stretch>
+                            <a:fillRect/>
+                          </a:stretch>
+                        </pic:blipFill>
+                        <pic:spPr>
+                          <a:xfrm>
+                            <a:off x="0" y="0"/>
+                            <a:ext cx="3601720" cy="2851785"/>
+                          </a:xfrm>
+                          <a:prstGeom prst="rect"/>
+                          <a:ln/>
+                        </pic:spPr>
+                      </pic:pic>
+                    </a:graphicData>
+                  </a:graphic>
+                </wp:inline>
+              </w:drawing>
+            </w:r>
+            <w:r>
+              <w:rPr>
+                <w:rtl w:val="0"/>
+              </w:rPr>
+            </w:r>
+          </w:p>
+        </w:tc>
+      </w:tr>
+    </w:tbl>
     <w:p>
       <w:pPr>
         <w:spacing w:after="0" w:before="0" w:line="480" w:lineRule="auto"/>

</xml_diff>

<commit_message>
Draft_126_body: universal table header/total fills from Timeline
Header D9E2F3; Total F2F2F2; body unshaded.
</commit_message>
<xml_diff>
--- a/thesis/003_ThesisProposal_Draft_126_body.docx
+++ b/thesis/003_ThesisProposal_Draft_126_body.docx
@@ -4113,14 +4113,14 @@
               <w:bottom w:color="000000" w:space="0" w:sz="4" w:val="single"/>
               <w:right w:color="000000" w:space="0" w:sz="0" w:val="nil"/>
             </w:tcBorders>
-            <w:shd w:fill="d9e2f3" w:val="clear"/>
-            <w:tcMar>
-              <w:top w:w="80.0" w:type="dxa"/>
-              <w:left w:w="80.0" w:type="dxa"/>
-              <w:bottom w:w="80.0" w:type="dxa"/>
-              <w:right w:w="80.0" w:type="dxa"/>
-            </w:tcMar>
-            <w:vAlign w:val="center"/>
+            <w:tcMar>
+              <w:top w:w="80.0" w:type="dxa"/>
+              <w:left w:w="80.0" w:type="dxa"/>
+              <w:bottom w:w="80.0" w:type="dxa"/>
+              <w:right w:w="80.0" w:type="dxa"/>
+            </w:tcMar>
+            <w:vAlign w:val="center"/>
+            <w:shd w:val="clear" w:color="auto" w:fill="D9E2F3"/>
           </w:tcPr>
           <w:p>
             <w:pPr>
@@ -4157,14 +4157,14 @@
               <w:bottom w:color="000000" w:space="0" w:sz="4" w:val="single"/>
               <w:right w:color="000000" w:space="0" w:sz="0" w:val="nil"/>
             </w:tcBorders>
-            <w:shd w:fill="d9e2f3" w:val="clear"/>
-            <w:tcMar>
-              <w:top w:w="80.0" w:type="dxa"/>
-              <w:left w:w="80.0" w:type="dxa"/>
-              <w:bottom w:w="80.0" w:type="dxa"/>
-              <w:right w:w="80.0" w:type="dxa"/>
-            </w:tcMar>
-            <w:vAlign w:val="center"/>
+            <w:tcMar>
+              <w:top w:w="80.0" w:type="dxa"/>
+              <w:left w:w="80.0" w:type="dxa"/>
+              <w:bottom w:w="80.0" w:type="dxa"/>
+              <w:right w:w="80.0" w:type="dxa"/>
+            </w:tcMar>
+            <w:vAlign w:val="center"/>
+            <w:shd w:val="clear" w:color="auto" w:fill="D9E2F3"/>
           </w:tcPr>
           <w:p>
             <w:pPr>
@@ -4759,14 +4759,14 @@
               <w:bottom w:color="000000" w:space="0" w:sz="18" w:val="single"/>
               <w:right w:color="000000" w:space="0" w:sz="0" w:val="nil"/>
             </w:tcBorders>
-            <w:shd w:fill="f2f2f2" w:val="clear"/>
-            <w:tcMar>
-              <w:top w:w="80.0" w:type="dxa"/>
-              <w:left w:w="80.0" w:type="dxa"/>
-              <w:bottom w:w="80.0" w:type="dxa"/>
-              <w:right w:w="80.0" w:type="dxa"/>
-            </w:tcMar>
-            <w:vAlign w:val="center"/>
+            <w:tcMar>
+              <w:top w:w="80.0" w:type="dxa"/>
+              <w:left w:w="80.0" w:type="dxa"/>
+              <w:bottom w:w="80.0" w:type="dxa"/>
+              <w:right w:w="80.0" w:type="dxa"/>
+            </w:tcMar>
+            <w:vAlign w:val="center"/>
+            <w:shd w:val="clear" w:color="auto" w:fill="F2F2F2"/>
           </w:tcPr>
           <w:p>
             <w:pPr>
@@ -4803,14 +4803,14 @@
               <w:bottom w:color="000000" w:space="0" w:sz="18" w:val="single"/>
               <w:right w:color="000000" w:space="0" w:sz="0" w:val="nil"/>
             </w:tcBorders>
-            <w:shd w:fill="f2f2f2" w:val="clear"/>
-            <w:tcMar>
-              <w:top w:w="80.0" w:type="dxa"/>
-              <w:left w:w="80.0" w:type="dxa"/>
-              <w:bottom w:w="80.0" w:type="dxa"/>
-              <w:right w:w="80.0" w:type="dxa"/>
-            </w:tcMar>
-            <w:vAlign w:val="center"/>
+            <w:tcMar>
+              <w:top w:w="80.0" w:type="dxa"/>
+              <w:left w:w="80.0" w:type="dxa"/>
+              <w:bottom w:w="80.0" w:type="dxa"/>
+              <w:right w:w="80.0" w:type="dxa"/>
+            </w:tcMar>
+            <w:vAlign w:val="center"/>
+            <w:shd w:val="clear" w:color="auto" w:fill="F2F2F2"/>
           </w:tcPr>
           <w:p>
             <w:pPr>
@@ -5011,6 +5011,7 @@
               <w:right w:w="80.0" w:type="dxa"/>
             </w:tcMar>
             <w:vAlign w:val="center"/>
+            <w:shd w:val="clear" w:color="auto" w:fill="D9E2F3"/>
           </w:tcPr>
           <w:p>
             <w:pPr>
@@ -5054,6 +5055,7 @@
               <w:right w:w="80.0" w:type="dxa"/>
             </w:tcMar>
             <w:vAlign w:val="center"/>
+            <w:shd w:val="clear" w:color="auto" w:fill="D9E2F3"/>
           </w:tcPr>
           <w:p>
             <w:pPr>
@@ -5097,6 +5099,7 @@
               <w:right w:w="80.0" w:type="dxa"/>
             </w:tcMar>
             <w:vAlign w:val="center"/>
+            <w:shd w:val="clear" w:color="auto" w:fill="D9E2F3"/>
           </w:tcPr>
           <w:p>
             <w:pPr>
@@ -6751,6 +6754,7 @@
               <w:right w:w="80.0" w:type="dxa"/>
             </w:tcMar>
             <w:vAlign w:val="center"/>
+            <w:shd w:val="clear" w:color="auto" w:fill="D9E2F3"/>
           </w:tcPr>
           <w:p>
             <w:pPr>
@@ -6797,6 +6801,7 @@
               <w:right w:w="80.0" w:type="dxa"/>
             </w:tcMar>
             <w:vAlign w:val="center"/>
+            <w:shd w:val="clear" w:color="auto" w:fill="D9E2F3"/>
           </w:tcPr>
           <w:p>
             <w:pPr>
@@ -6843,6 +6848,7 @@
               <w:right w:w="80.0" w:type="dxa"/>
             </w:tcMar>
             <w:vAlign w:val="center"/>
+            <w:shd w:val="clear" w:color="auto" w:fill="D9E2F3"/>
           </w:tcPr>
           <w:p>
             <w:pPr>
@@ -6889,6 +6895,7 @@
               <w:right w:w="80.0" w:type="dxa"/>
             </w:tcMar>
             <w:vAlign w:val="center"/>
+            <w:shd w:val="clear" w:color="auto" w:fill="D9E2F3"/>
           </w:tcPr>
           <w:p>
             <w:pPr>
@@ -6935,6 +6942,7 @@
               <w:right w:w="80.0" w:type="dxa"/>
             </w:tcMar>
             <w:vAlign w:val="center"/>
+            <w:shd w:val="clear" w:color="auto" w:fill="D9E2F3"/>
           </w:tcPr>
           <w:p>
             <w:pPr>
@@ -6981,6 +6989,7 @@
               <w:right w:w="80.0" w:type="dxa"/>
             </w:tcMar>
             <w:vAlign w:val="center"/>
+            <w:shd w:val="clear" w:color="auto" w:fill="D9E2F3"/>
           </w:tcPr>
           <w:p>
             <w:pPr>
@@ -8647,6 +8656,7 @@
               <w:right w:w="80.0" w:type="dxa"/>
             </w:tcMar>
             <w:vAlign w:val="center"/>
+            <w:shd w:val="clear" w:color="auto" w:fill="D9E2F3"/>
           </w:tcPr>
           <w:p>
             <w:pPr>
@@ -8690,6 +8700,7 @@
               <w:right w:w="80.0" w:type="dxa"/>
             </w:tcMar>
             <w:vAlign w:val="center"/>
+            <w:shd w:val="clear" w:color="auto" w:fill="D9E2F3"/>
           </w:tcPr>
           <w:p>
             <w:pPr>
@@ -8733,6 +8744,7 @@
               <w:right w:w="80.0" w:type="dxa"/>
             </w:tcMar>
             <w:vAlign w:val="center"/>
+            <w:shd w:val="clear" w:color="auto" w:fill="D9E2F3"/>
           </w:tcPr>
           <w:p>
             <w:pPr>
@@ -8776,6 +8788,7 @@
               <w:right w:w="80.0" w:type="dxa"/>
             </w:tcMar>
             <w:vAlign w:val="center"/>
+            <w:shd w:val="clear" w:color="auto" w:fill="D9E2F3"/>
           </w:tcPr>
           <w:p>
             <w:pPr>
@@ -8819,6 +8832,7 @@
               <w:right w:w="80.0" w:type="dxa"/>
             </w:tcMar>
             <w:vAlign w:val="center"/>
+            <w:shd w:val="clear" w:color="auto" w:fill="D9E2F3"/>
           </w:tcPr>
           <w:p>
             <w:pPr>
@@ -11624,6 +11638,7 @@
               <w:right w:w="80.0" w:type="dxa"/>
             </w:tcMar>
             <w:vAlign w:val="center"/>
+            <w:shd w:val="clear" w:color="auto" w:fill="F2F2F2"/>
           </w:tcPr>
           <w:p>
             <w:pPr>
@@ -11667,6 +11682,7 @@
               <w:right w:w="80.0" w:type="dxa"/>
             </w:tcMar>
             <w:vAlign w:val="center"/>
+            <w:shd w:val="clear" w:color="auto" w:fill="F2F2F2"/>
           </w:tcPr>
           <w:p>
             <w:pPr>
@@ -11697,6 +11713,7 @@
               <w:right w:w="80.0" w:type="dxa"/>
             </w:tcMar>
             <w:vAlign w:val="center"/>
+            <w:shd w:val="clear" w:color="auto" w:fill="F2F2F2"/>
           </w:tcPr>
           <w:p>
             <w:pPr>
@@ -11740,6 +11757,7 @@
               <w:right w:w="80.0" w:type="dxa"/>
             </w:tcMar>
             <w:vAlign w:val="center"/>
+            <w:shd w:val="clear" w:color="auto" w:fill="F2F2F2"/>
           </w:tcPr>
           <w:p>
             <w:pPr>
@@ -11783,6 +11801,7 @@
               <w:right w:w="80.0" w:type="dxa"/>
             </w:tcMar>
             <w:vAlign w:val="center"/>
+            <w:shd w:val="clear" w:color="auto" w:fill="F2F2F2"/>
           </w:tcPr>
           <w:p>
             <w:pPr>
@@ -12092,6 +12111,7 @@
               <w:right w:w="80.0" w:type="dxa"/>
             </w:tcMar>
             <w:vAlign w:val="center"/>
+            <w:shd w:val="clear" w:color="auto" w:fill="D9E2F3"/>
           </w:tcPr>
           <w:p>
             <w:pPr>
@@ -12135,6 +12155,7 @@
               <w:right w:w="80.0" w:type="dxa"/>
             </w:tcMar>
             <w:vAlign w:val="center"/>
+            <w:shd w:val="clear" w:color="auto" w:fill="D9E2F3"/>
           </w:tcPr>
           <w:p>
             <w:pPr>
@@ -12178,6 +12199,7 @@
               <w:right w:w="80.0" w:type="dxa"/>
             </w:tcMar>
             <w:vAlign w:val="center"/>
+            <w:shd w:val="clear" w:color="auto" w:fill="D9E2F3"/>
           </w:tcPr>
           <w:p>
             <w:pPr>
@@ -12221,6 +12243,7 @@
               <w:right w:w="80.0" w:type="dxa"/>
             </w:tcMar>
             <w:vAlign w:val="center"/>
+            <w:shd w:val="clear" w:color="auto" w:fill="D9E2F3"/>
           </w:tcPr>
           <w:p>
             <w:pPr>
@@ -12264,6 +12287,7 @@
               <w:right w:w="80.0" w:type="dxa"/>
             </w:tcMar>
             <w:vAlign w:val="center"/>
+            <w:shd w:val="clear" w:color="auto" w:fill="D9E2F3"/>
           </w:tcPr>
           <w:p>
             <w:pPr>
@@ -14036,6 +14060,7 @@
               <w:right w:w="80.0" w:type="dxa"/>
             </w:tcMar>
             <w:vAlign w:val="center"/>
+            <w:shd w:val="clear" w:color="auto" w:fill="D9E2F3"/>
           </w:tcPr>
           <w:p>
             <w:pPr>
@@ -14079,6 +14104,7 @@
               <w:right w:w="80.0" w:type="dxa"/>
             </w:tcMar>
             <w:vAlign w:val="center"/>
+            <w:shd w:val="clear" w:color="auto" w:fill="D9E2F3"/>
           </w:tcPr>
           <w:p>
             <w:pPr>
@@ -14122,6 +14148,7 @@
               <w:right w:w="80.0" w:type="dxa"/>
             </w:tcMar>
             <w:vAlign w:val="center"/>
+            <w:shd w:val="clear" w:color="auto" w:fill="D9E2F3"/>
           </w:tcPr>
           <w:p>
             <w:pPr>
@@ -14165,6 +14192,7 @@
               <w:right w:w="80.0" w:type="dxa"/>
             </w:tcMar>
             <w:vAlign w:val="center"/>
+            <w:shd w:val="clear" w:color="auto" w:fill="D9E2F3"/>
           </w:tcPr>
           <w:p>
             <w:pPr>
@@ -14208,6 +14236,7 @@
               <w:right w:w="80.0" w:type="dxa"/>
             </w:tcMar>
             <w:vAlign w:val="center"/>
+            <w:shd w:val="clear" w:color="auto" w:fill="D9E2F3"/>
           </w:tcPr>
           <w:p>
             <w:pPr>
@@ -15450,6 +15479,7 @@
               <w:right w:w="80.0" w:type="dxa"/>
             </w:tcMar>
             <w:vAlign w:val="center"/>
+            <w:shd w:val="clear" w:color="auto" w:fill="D9E2F3"/>
           </w:tcPr>
           <w:p>
             <w:pPr>
@@ -15496,6 +15526,7 @@
               <w:right w:w="80.0" w:type="dxa"/>
             </w:tcMar>
             <w:vAlign w:val="center"/>
+            <w:shd w:val="clear" w:color="auto" w:fill="D9E2F3"/>
           </w:tcPr>
           <w:p>
             <w:pPr>
@@ -15542,6 +15573,7 @@
               <w:right w:w="80.0" w:type="dxa"/>
             </w:tcMar>
             <w:vAlign w:val="center"/>
+            <w:shd w:val="clear" w:color="auto" w:fill="D9E2F3"/>
           </w:tcPr>
           <w:p>
             <w:pPr>
@@ -16026,6 +16058,7 @@
               <w:right w:w="80.0" w:type="dxa"/>
             </w:tcMar>
             <w:vAlign w:val="center"/>
+            <w:shd w:val="clear" w:color="auto" w:fill="F2F2F2"/>
           </w:tcPr>
           <w:p>
             <w:pPr>
@@ -16072,6 +16105,7 @@
               <w:right w:w="80.0" w:type="dxa"/>
             </w:tcMar>
             <w:vAlign w:val="center"/>
+            <w:shd w:val="clear" w:color="auto" w:fill="F2F2F2"/>
           </w:tcPr>
           <w:p>
             <w:pPr>
@@ -16118,6 +16152,7 @@
               <w:right w:w="80.0" w:type="dxa"/>
             </w:tcMar>
             <w:vAlign w:val="center"/>
+            <w:shd w:val="clear" w:color="auto" w:fill="F2F2F2"/>
           </w:tcPr>
           <w:p>
             <w:pPr>
@@ -16359,6 +16394,7 @@
               <w:right w:w="80.0" w:type="dxa"/>
             </w:tcMar>
             <w:vAlign w:val="center"/>
+            <w:shd w:val="clear" w:color="auto" w:fill="D9E2F3"/>
           </w:tcPr>
           <w:p>
             <w:pPr>
@@ -16402,6 +16438,7 @@
               <w:right w:w="80.0" w:type="dxa"/>
             </w:tcMar>
             <w:vAlign w:val="center"/>
+            <w:shd w:val="clear" w:color="auto" w:fill="D9E2F3"/>
           </w:tcPr>
           <w:p>
             <w:pPr>
@@ -16445,6 +16482,7 @@
               <w:right w:w="80.0" w:type="dxa"/>
             </w:tcMar>
             <w:vAlign w:val="center"/>
+            <w:shd w:val="clear" w:color="auto" w:fill="D9E2F3"/>
           </w:tcPr>
           <w:p>
             <w:pPr>
@@ -16488,6 +16526,7 @@
               <w:right w:w="80.0" w:type="dxa"/>
             </w:tcMar>
             <w:vAlign w:val="center"/>
+            <w:shd w:val="clear" w:color="auto" w:fill="D9E2F3"/>
           </w:tcPr>
           <w:p>
             <w:pPr>
@@ -16531,6 +16570,7 @@
               <w:right w:w="80.0" w:type="dxa"/>
             </w:tcMar>
             <w:vAlign w:val="center"/>
+            <w:shd w:val="clear" w:color="auto" w:fill="D9E2F3"/>
           </w:tcPr>
           <w:p>
             <w:pPr>
@@ -18028,6 +18068,7 @@
               <w:right w:w="80.0" w:type="dxa"/>
             </w:tcMar>
             <w:vAlign w:val="center"/>
+            <w:shd w:val="clear" w:color="auto" w:fill="D9E2F3"/>
           </w:tcPr>
           <w:p>
             <w:pPr>
@@ -18071,6 +18112,7 @@
               <w:right w:w="80.0" w:type="dxa"/>
             </w:tcMar>
             <w:vAlign w:val="center"/>
+            <w:shd w:val="clear" w:color="auto" w:fill="D9E2F3"/>
           </w:tcPr>
           <w:p>
             <w:pPr>
@@ -18114,6 +18156,7 @@
               <w:right w:w="80.0" w:type="dxa"/>
             </w:tcMar>
             <w:vAlign w:val="center"/>
+            <w:shd w:val="clear" w:color="auto" w:fill="D9E2F3"/>
           </w:tcPr>
           <w:p>
             <w:pPr>
@@ -18157,6 +18200,7 @@
               <w:right w:w="80.0" w:type="dxa"/>
             </w:tcMar>
             <w:vAlign w:val="center"/>
+            <w:shd w:val="clear" w:color="auto" w:fill="D9E2F3"/>
           </w:tcPr>
           <w:p>
             <w:pPr>
@@ -19509,6 +19553,7 @@
               <w:right w:w="80.0" w:type="dxa"/>
             </w:tcMar>
             <w:vAlign w:val="center"/>
+            <w:shd w:val="clear" w:color="auto" w:fill="D9E2F3"/>
           </w:tcPr>
           <w:p>
             <w:pPr>
@@ -19555,6 +19600,7 @@
               <w:right w:w="80.0" w:type="dxa"/>
             </w:tcMar>
             <w:vAlign w:val="center"/>
+            <w:shd w:val="clear" w:color="auto" w:fill="D9E2F3"/>
           </w:tcPr>
           <w:p>
             <w:pPr>
@@ -19601,6 +19647,7 @@
               <w:right w:w="80.0" w:type="dxa"/>
             </w:tcMar>
             <w:vAlign w:val="center"/>
+            <w:shd w:val="clear" w:color="auto" w:fill="D9E2F3"/>
           </w:tcPr>
           <w:p>
             <w:pPr>
@@ -19647,6 +19694,7 @@
               <w:right w:w="80.0" w:type="dxa"/>
             </w:tcMar>
             <w:vAlign w:val="center"/>
+            <w:shd w:val="clear" w:color="auto" w:fill="D9E2F3"/>
           </w:tcPr>
           <w:p>
             <w:pPr>
@@ -19693,6 +19741,7 @@
               <w:right w:w="80.0" w:type="dxa"/>
             </w:tcMar>
             <w:vAlign w:val="center"/>
+            <w:shd w:val="clear" w:color="auto" w:fill="D9E2F3"/>
           </w:tcPr>
           <w:p>
             <w:pPr>
@@ -20925,6 +20974,7 @@
               <w:right w:w="80.0" w:type="dxa"/>
             </w:tcMar>
             <w:vAlign w:val="center"/>
+            <w:shd w:val="clear" w:color="auto" w:fill="F2F2F2"/>
           </w:tcPr>
           <w:p>
             <w:pPr>
@@ -20971,6 +21021,7 @@
               <w:right w:w="80.0" w:type="dxa"/>
             </w:tcMar>
             <w:vAlign w:val="center"/>
+            <w:shd w:val="clear" w:color="auto" w:fill="F2F2F2"/>
           </w:tcPr>
           <w:p>
             <w:pPr>
@@ -21017,6 +21068,7 @@
               <w:right w:w="80.0" w:type="dxa"/>
             </w:tcMar>
             <w:vAlign w:val="center"/>
+            <w:shd w:val="clear" w:color="auto" w:fill="F2F2F2"/>
           </w:tcPr>
           <w:p>
             <w:pPr>
@@ -21063,6 +21115,7 @@
               <w:right w:w="80.0" w:type="dxa"/>
             </w:tcMar>
             <w:vAlign w:val="center"/>
+            <w:shd w:val="clear" w:color="auto" w:fill="F2F2F2"/>
           </w:tcPr>
           <w:p>
             <w:pPr>
@@ -21109,6 +21162,7 @@
               <w:right w:w="80.0" w:type="dxa"/>
             </w:tcMar>
             <w:vAlign w:val="center"/>
+            <w:shd w:val="clear" w:color="auto" w:fill="F2F2F2"/>
           </w:tcPr>
           <w:p>
             <w:pPr>
@@ -21339,6 +21393,7 @@
               <w:right w:w="80.0" w:type="dxa"/>
             </w:tcMar>
             <w:vAlign w:val="center"/>
+            <w:shd w:val="clear" w:color="auto" w:fill="D9E2F3"/>
           </w:tcPr>
           <w:p>
             <w:pPr>
@@ -21382,6 +21437,7 @@
               <w:right w:w="80.0" w:type="dxa"/>
             </w:tcMar>
             <w:vAlign w:val="center"/>
+            <w:shd w:val="clear" w:color="auto" w:fill="D9E2F3"/>
           </w:tcPr>
           <w:p>
             <w:pPr>
@@ -21425,6 +21481,7 @@
               <w:right w:w="80.0" w:type="dxa"/>
             </w:tcMar>
             <w:vAlign w:val="center"/>
+            <w:shd w:val="clear" w:color="auto" w:fill="D9E2F3"/>
           </w:tcPr>
           <w:p>
             <w:pPr>
@@ -21468,6 +21525,7 @@
               <w:right w:w="80.0" w:type="dxa"/>
             </w:tcMar>
             <w:vAlign w:val="center"/>
+            <w:shd w:val="clear" w:color="auto" w:fill="D9E2F3"/>
           </w:tcPr>
           <w:p>
             <w:pPr>
@@ -21511,6 +21569,7 @@
               <w:right w:w="80.0" w:type="dxa"/>
             </w:tcMar>
             <w:vAlign w:val="center"/>
+            <w:shd w:val="clear" w:color="auto" w:fill="D9E2F3"/>
           </w:tcPr>
           <w:p>
             <w:pPr>

</xml_diff>

<commit_message>
Draft_126_body: re-apply header/total fills on all table cells
</commit_message>
<xml_diff>
--- a/thesis/003_ThesisProposal_Draft_126_body.docx
+++ b/thesis/003_ThesisProposal_Draft_126_body.docx
@@ -7042,6 +7042,7 @@
               <w:right w:w="80.0" w:type="dxa"/>
             </w:tcMar>
             <w:vAlign w:val="center"/>
+            <w:shd w:val="clear" w:color="auto" w:fill="F2F2F2"/>
           </w:tcPr>
           <w:p>
             <w:pPr>
@@ -7088,6 +7089,7 @@
               <w:right w:w="80.0" w:type="dxa"/>
             </w:tcMar>
             <w:vAlign w:val="center"/>
+            <w:shd w:val="clear" w:color="auto" w:fill="F2F2F2"/>
           </w:tcPr>
           <w:p>
             <w:pPr>
@@ -7134,6 +7136,7 @@
               <w:right w:w="80.0" w:type="dxa"/>
             </w:tcMar>
             <w:vAlign w:val="center"/>
+            <w:shd w:val="clear" w:color="auto" w:fill="F2F2F2"/>
           </w:tcPr>
           <w:p>
             <w:pPr>
@@ -7180,6 +7183,7 @@
               <w:right w:w="80.0" w:type="dxa"/>
             </w:tcMar>
             <w:vAlign w:val="center"/>
+            <w:shd w:val="clear" w:color="auto" w:fill="F2F2F2"/>
           </w:tcPr>
           <w:p>
             <w:pPr>
@@ -7226,6 +7230,7 @@
               <w:right w:w="80.0" w:type="dxa"/>
             </w:tcMar>
             <w:vAlign w:val="center"/>
+            <w:shd w:val="clear" w:color="auto" w:fill="F2F2F2"/>
           </w:tcPr>
           <w:p>
             <w:pPr>
@@ -7272,6 +7277,7 @@
               <w:right w:w="80.0" w:type="dxa"/>
             </w:tcMar>
             <w:vAlign w:val="center"/>
+            <w:shd w:val="clear" w:color="auto" w:fill="F2F2F2"/>
           </w:tcPr>
           <w:p>
             <w:pPr>
@@ -12337,6 +12343,7 @@
               <w:right w:w="80.0" w:type="dxa"/>
             </w:tcMar>
             <w:vAlign w:val="center"/>
+            <w:shd w:val="clear" w:color="auto" w:fill="F2F2F2"/>
           </w:tcPr>
           <w:p>
             <w:pPr>
@@ -12380,6 +12387,7 @@
               <w:right w:w="80.0" w:type="dxa"/>
             </w:tcMar>
             <w:vAlign w:val="center"/>
+            <w:shd w:val="clear" w:color="auto" w:fill="F2F2F2"/>
           </w:tcPr>
           <w:p>
             <w:pPr>
@@ -12423,6 +12431,7 @@
               <w:right w:w="80.0" w:type="dxa"/>
             </w:tcMar>
             <w:vAlign w:val="center"/>
+            <w:shd w:val="clear" w:color="auto" w:fill="F2F2F2"/>
           </w:tcPr>
           <w:p>
             <w:pPr>
@@ -12466,6 +12475,7 @@
               <w:right w:w="80.0" w:type="dxa"/>
             </w:tcMar>
             <w:vAlign w:val="center"/>
+            <w:shd w:val="clear" w:color="auto" w:fill="F2F2F2"/>
           </w:tcPr>
           <w:p>
             <w:pPr>
@@ -12509,6 +12519,7 @@
               <w:right w:w="80.0" w:type="dxa"/>
             </w:tcMar>
             <w:vAlign w:val="center"/>
+            <w:shd w:val="clear" w:color="auto" w:fill="F2F2F2"/>
           </w:tcPr>
           <w:p>
             <w:pPr>

</xml_diff>